<commit_message>
docs(thesis): close recruitment and drop the task-set sign-off item
The supervisor is recruiting through his own professional connections, so
the LinkedIn free-tier limit is moot and recruitment is no longer a blocker
on running sessions. What it does not settle - achieved N and sample
composition, and the convenience-sample bound that follows - is recorded as
something Chapter 9 must report rather than left implied.

Supervisor sign-off on the task set and session length is dropped by
decision; the pilot run now carries the session-length validation alone.

The arm split is now the only open evaluation decision, and the forms build
guide says so, along with the single build detail it gates.

Evaluation package rebuilt: 84 pages, 0 en or em dashes.
</commit_message>
<xml_diff>
--- a/docs/thesis/evaluation/Apex-Evaluation-Package.docx
+++ b/docs/thesis/evaluation/Apex-Evaluation-Package.docx
@@ -55,7 +55,7 @@
       <w:r>
         <w:rPr/>
         <w:br/>
-        <w:t xml:space="preserve">Generated 2026-08-17 </w:t>
+        <w:t xml:space="preserve">Generated 2026-08-19 </w:t>
       </w:r>
     </w:p>
     <w:p>
@@ -820,6 +820,22 @@
         <w:br/>
         <w:t xml:space="preserve">moderated sessions. </w:t>
       </w:r>
+      <w:r>
+        <w:rPr>
+          <w:rStyle w:val="StrongEmphasis"/>
+        </w:rPr>
+        <w:t>This is now the only open decision in this list</w:t>
+      </w:r>
+      <w:r>
+        <w:rPr/>
+        <w:t>, and</w:t>
+        <w:br/>
+        <w:t>the only thing it changes in the build is F0 question 5, the screen-and-audio</w:t>
+        <w:br/>
+        <w:t>recording consent item: keep it if the moderated arm runs, delete it if not.</w:t>
+        <w:br/>
+        <w:t xml:space="preserve">Everything else can be built before it is settled. </w:t>
+      </w:r>
     </w:p>
     <w:p>
       <w:pPr>
@@ -1201,9 +1217,24 @@
       </w:pPr>
       <w:r>
         <w:rPr/>
-        <w:t>Recruit and run. Reset the demo project between participants and verify the</w:t>
-        <w:br/>
-        <w:t xml:space="preserve">reset. </w:t>
+        <w:t>Recruit and run. Recruitment runs through the supervisor's professional</w:t>
+        <w:br/>
+        <w:t>connections (settled 2026-08-17), so the job here is scheduling, not</w:t>
+        <w:br/>
+        <w:t>sourcing. Record which channel each participant came from - it is what</w:t>
+        <w:br/>
+      </w:r>
+      <w:r>
+        <w:rPr>
+          <w:rStyle w:val="SourceText"/>
+        </w:rPr>
+        <w:t>\Cref{sec:eval_participants}</w:t>
+      </w:r>
+      <w:r>
+        <w:rPr/>
+        <w:t xml:space="preserve"> has to report. Reset the demo project</w:t>
+        <w:br/>
+        <w:t xml:space="preserve">between participants and verify the reset. </w:t>
       </w:r>
     </w:p>
     <w:p>
@@ -20245,62 +20276,89 @@
           <w:tab w:val="left" w:pos="709" w:leader="none"/>
         </w:tabs>
         <w:bidi w:val="0"/>
-        <w:spacing w:before="0" w:after="0"/>
         <w:ind w:left="709" w:hanging="283"/>
         <w:jc w:val="left"/>
         <w:rPr/>
       </w:pPr>
       <w:r>
+        <w:rPr/>
+        <w:t xml:space="preserve">~~N and recruitment.~~ </w:t>
+      </w:r>
+      <w:r>
         <w:rPr>
           <w:rStyle w:val="StrongEmphasis"/>
         </w:rPr>
-        <w:t>N and recruitment.</w:t>
-      </w:r>
-      <w:r>
-        <w:rPr/>
-        <w:t xml:space="preserve"> Whether the partner organisation can supply 12, or</w:t>
-        <w:br/>
-        <w:t>whether the sample gets topped up with MEIC students, which changes the</w:t>
-        <w:br/>
-        <w:t>external-validity claim. The LinkedIn free-tier limit of five noted</w:t>
-        <w:br/>
-        <w:t>connection requests per month was raised with the supervisor 2026-08-12; he</w:t>
-        <w:br/>
-        <w:t xml:space="preserve">deferred it to a meeting on </w:t>
+        <w:t>Resolved 2026-08-17: the supervisor is recruiting</w:t>
+        <w:br/>
+        <w:t>through his own professional connections.</w:t>
+      </w:r>
+      <w:r>
+        <w:rPr/>
+        <w:t xml:space="preserve"> The LinkedIn free-tier limit of</w:t>
+        <w:br/>
+        <w:t>five noted connection requests per month, raised 2026-08-12, is therefore</w:t>
+        <w:br/>
+        <w:t>moot - that channel is not the one being used. This is no longer a blocker</w:t>
+        <w:br/>
+        <w:t xml:space="preserve">on our side and no longer a work item; it is a waiting item. </w:t>
+      </w:r>
+    </w:p>
+    <w:p>
+      <w:pPr>
+        <w:pStyle w:val="TextBody"/>
+        <w:bidi w:val="0"/>
+        <w:jc w:val="left"/>
+        <w:rPr/>
+      </w:pPr>
+      <w:r>
+        <w:rPr/>
+        <w:t xml:space="preserve">What it does </w:t>
       </w:r>
       <w:r>
         <w:rPr>
           <w:rStyle w:val="StrongEmphasis"/>
         </w:rPr>
-        <w:t>Monday 2026-08-17</w:t>
-      </w:r>
-      <w:r>
-        <w:rPr/>
-        <w:t>. Still open - this is the</w:t>
-        <w:br/>
-        <w:t xml:space="preserve">only remaining blocker on running sessions. </w:t>
-      </w:r>
-    </w:p>
-    <w:p>
-      <w:pPr>
-        <w:pStyle w:val="TextBody"/>
-        <w:numPr>
-          <w:ilvl w:val="0"/>
-          <w:numId w:val="20"/>
-        </w:numPr>
-        <w:tabs>
-          <w:tab w:val="clear" w:pos="1134"/>
-          <w:tab w:val="left" w:pos="709" w:leader="none"/>
-        </w:tabs>
-        <w:bidi w:val="0"/>
-        <w:spacing w:before="0" w:after="0"/>
-        <w:ind w:left="709" w:hanging="283"/>
-        <w:jc w:val="left"/>
-        <w:rPr/>
-      </w:pPr>
-      <w:r>
-        <w:rPr/>
-        <w:t xml:space="preserve">~~Ethics approval.~~ </w:t>
+        <w:t>not</w:t>
+      </w:r>
+      <w:r>
+        <w:rPr/>
+        <w:t xml:space="preserve"> resolve, and what still has to be recorded once the</w:t>
+        <w:br/>
+        <w:t>participants are known: the achieved N, and the composition of the sample.</w:t>
+        <w:br/>
+        <w:t>A sample drawn entirely from one supervisor's network is a convenience</w:t>
+        <w:br/>
+        <w:t>sample, and if it turns out to be academic rather than industrial, or</w:t>
+        <w:br/>
+        <w:t>concentrated in one organisation, that bounds the external-validity claim.</w:t>
+        <w:br/>
+        <w:t>State the channel and the composition plainly in</w:t>
+        <w:br/>
+      </w:r>
+      <w:r>
+        <w:rPr>
+          <w:rStyle w:val="SourceText"/>
+        </w:rPr>
+        <w:t>\Cref{sec:eval_participants}</w:t>
+      </w:r>
+      <w:r>
+        <w:rPr/>
+        <w:t xml:space="preserve"> and carry the limit into</w:t>
+        <w:br/>
+      </w:r>
+      <w:r>
+        <w:rPr>
+          <w:rStyle w:val="SourceText"/>
+        </w:rPr>
+        <w:t>\Cref{sec:threats}</w:t>
+      </w:r>
+      <w:r>
+        <w:rPr/>
+        <w:t>; do not let it read as a random sample of</w:t>
+        <w:br/>
+        <w:t>practitioners.</w:t>
+        <w:br/>
+        <w:t xml:space="preserve">4. ~~Ethics approval.~~ </w:t>
       </w:r>
       <w:r>
         <w:rPr>
@@ -20358,26 +20416,10 @@
         <w:rPr/>
         <w:t xml:space="preserve"> of Chapter 9, which now states the route, the</w:t>
         <w:br/>
-        <w:t xml:space="preserve">four-item consent structure, the coding scheme and the retention rule. </w:t>
-      </w:r>
-    </w:p>
-    <w:p>
-      <w:pPr>
-        <w:pStyle w:val="TextBody"/>
-        <w:numPr>
-          <w:ilvl w:val="0"/>
-          <w:numId w:val="20"/>
-        </w:numPr>
-        <w:tabs>
-          <w:tab w:val="clear" w:pos="1134"/>
-          <w:tab w:val="left" w:pos="709" w:leader="none"/>
-        </w:tabs>
-        <w:bidi w:val="0"/>
-        <w:spacing w:before="0" w:after="0"/>
-        <w:ind w:left="709" w:hanging="283"/>
-        <w:jc w:val="left"/>
-        <w:rPr/>
-      </w:pPr>
+        <w:t>four-item consent structure, the coding scheme and the retention rule.</w:t>
+        <w:br/>
+        <w:t xml:space="preserve">5. </w:t>
+      </w:r>
       <w:r>
         <w:rPr>
           <w:rStyle w:val="StrongEmphasis"/>
@@ -20390,29 +20432,9 @@
         <w:br/>
         <w:t>proposal. Confirm the moderated arm is worth the scheduling cost, or drop it</w:t>
         <w:br/>
-        <w:t xml:space="preserve">and accept losing the observational findings. </w:t>
-      </w:r>
-    </w:p>
-    <w:p>
-      <w:pPr>
-        <w:pStyle w:val="TextBody"/>
-        <w:numPr>
-          <w:ilvl w:val="0"/>
-          <w:numId w:val="20"/>
-        </w:numPr>
-        <w:tabs>
-          <w:tab w:val="clear" w:pos="1134"/>
-          <w:tab w:val="left" w:pos="709" w:leader="none"/>
-        </w:tabs>
-        <w:bidi w:val="0"/>
-        <w:spacing w:before="0" w:after="0"/>
-        <w:ind w:left="709" w:hanging="283"/>
-        <w:jc w:val="left"/>
-        <w:rPr/>
-      </w:pPr>
-      <w:r>
-        <w:rPr/>
-        <w:t xml:space="preserve">~~TLX response scale.~~ </w:t>
+        <w:t>and accept losing the observational findings.</w:t>
+        <w:br/>
+        <w:t xml:space="preserve">6. ~~TLX response scale.~~ </w:t>
       </w:r>
       <w:r>
         <w:rPr>
@@ -20432,28 +20454,9 @@
         <w:br/>
         <w:t>change once the first participant has run, and a mid-study change would make</w:t>
         <w:br/>
-        <w:t xml:space="preserve">the earlier and later responses two different instruments. </w:t>
-      </w:r>
-    </w:p>
-    <w:p>
-      <w:pPr>
-        <w:pStyle w:val="TextBody"/>
-        <w:numPr>
-          <w:ilvl w:val="0"/>
-          <w:numId w:val="20"/>
-        </w:numPr>
-        <w:tabs>
-          <w:tab w:val="clear" w:pos="1134"/>
-          <w:tab w:val="left" w:pos="709" w:leader="none"/>
-        </w:tabs>
-        <w:bidi w:val="0"/>
-        <w:ind w:left="709" w:hanging="283"/>
-        <w:jc w:val="left"/>
-        <w:rPr/>
-      </w:pPr>
-      <w:r>
-        <w:rPr/>
-        <w:t xml:space="preserve">~~Form platform.~~ </w:t>
+        <w:t>the earlier and later responses two different instruments.</w:t>
+        <w:br/>
+        <w:t xml:space="preserve">7. ~~Form platform.~~ </w:t>
       </w:r>
       <w:r>
         <w:rPr>
@@ -20479,7 +20482,7 @@
       </w:r>
       <w:r>
         <w:rPr/>
-        <w:t xml:space="preserve">. </w:t>
+        <w:t>.</w:t>
       </w:r>
     </w:p>
     <w:p>
@@ -22671,11 +22674,51 @@
       </w:pPr>
       <w:r>
         <w:rPr/>
-        <w:t>[ ] Supervisor sign-off on the task set and the session length. Raise it at</w:t>
-        <w:br/>
-        <w:t>the recruitment meeting on Monday 2026-08-17, which is already scheduled -</w:t>
-        <w:br/>
-        <w:t xml:space="preserve">it costs nothing extra and both items gate the same first session </w:t>
+        <w:t xml:space="preserve">[x] Supervisor sign-off on the task set and the session length - </w:t>
+      </w:r>
+      <w:r>
+        <w:rPr>
+          <w:rStyle w:val="StrongEmphasis"/>
+        </w:rPr>
+        <w:t>dropped</w:t>
+        <w:br/>
+        <w:t>2026-08-17 by decision.</w:t>
+      </w:r>
+      <w:r>
+        <w:rPr/>
+        <w:t xml:space="preserve"> The task set and the 60-minute budget are the</w:t>
+        <w:br/>
+        <w:t>researcher's own call and are not being put to the supervisor. The pilot</w:t>
+        <w:br/>
+        <w:t>run (step 12 of the forms build guide) is what validates the session</w:t>
+        <w:br/>
+        <w:t xml:space="preserve">length, and it now carries that job alone </w:t>
+      </w:r>
+    </w:p>
+    <w:p>
+      <w:pPr>
+        <w:pStyle w:val="TextBody"/>
+        <w:numPr>
+          <w:ilvl w:val="0"/>
+          <w:numId w:val="21"/>
+        </w:numPr>
+        <w:tabs>
+          <w:tab w:val="clear" w:pos="1134"/>
+          <w:tab w:val="left" w:pos="709" w:leader="none"/>
+        </w:tabs>
+        <w:bidi w:val="0"/>
+        <w:spacing w:before="0" w:after="0"/>
+        <w:ind w:left="709" w:hanging="283"/>
+        <w:jc w:val="left"/>
+        <w:rPr/>
+      </w:pPr>
+      <w:r>
+        <w:rPr/>
+        <w:t>[x] Recruitment channel settled 2026-08-17: the supervisor recruits through</w:t>
+        <w:br/>
+        <w:t>his professional connections. Achieved N and sample composition are still</w:t>
+        <w:br/>
+        <w:t xml:space="preserve">unknown and must be reported honestly when they are </w:t>
       </w:r>
     </w:p>
     <w:p>

</xml_diff>